<commit_message>
Upload sse365 lab6 materials
</commit_message>
<xml_diff>
--- a/teaching/sse316/labs/lab6_report.docx
+++ b/teaching/sse316/labs/lab6_report.docx
@@ -4,41 +4,41 @@
   <w:body>
     <w:p>
       <w:pPr>
-        <w:pStyle w:val="a7"/>
+        <w:pStyle w:val="Title"/>
         <w:pBdr>
           <w:bottom w:val="single" w:sz="8" w:space="13" w:color="4F81BD"/>
         </w:pBdr>
         <w:adjustRightInd w:val="0"/>
         <w:spacing w:after="0"/>
         <w:rPr>
-          <w:rFonts w:ascii="微软雅黑" w:eastAsia="微软雅黑" w:hAnsi="微软雅黑" w:hint="eastAsia"/>
+          <w:rFonts w:ascii="Microsoft YaHei" w:eastAsia="Microsoft YaHei" w:hAnsi="Microsoft YaHei"/>
           <w:sz w:val="36"/>
         </w:rPr>
       </w:pPr>
       <w:r>
         <w:rPr>
-          <w:rFonts w:ascii="微软雅黑" w:eastAsia="微软雅黑" w:hAnsi="微软雅黑" w:hint="eastAsia"/>
+          <w:rFonts w:ascii="Microsoft YaHei" w:eastAsia="Microsoft YaHei" w:hAnsi="Microsoft YaHei" w:hint="eastAsia"/>
           <w:sz w:val="36"/>
         </w:rPr>
         <w:t>SSE</w:t>
       </w:r>
       <w:r>
         <w:rPr>
-          <w:rFonts w:ascii="微软雅黑" w:eastAsia="微软雅黑" w:hAnsi="微软雅黑"/>
+          <w:rFonts w:ascii="Microsoft YaHei" w:eastAsia="Microsoft YaHei" w:hAnsi="Microsoft YaHei"/>
           <w:sz w:val="36"/>
         </w:rPr>
         <w:t>365</w:t>
       </w:r>
       <w:r>
         <w:rPr>
-          <w:rFonts w:ascii="微软雅黑" w:eastAsia="微软雅黑" w:hAnsi="微软雅黑" w:hint="eastAsia"/>
+          <w:rFonts w:ascii="Microsoft YaHei" w:eastAsia="Microsoft YaHei" w:hAnsi="Microsoft YaHei" w:hint="eastAsia"/>
           <w:sz w:val="36"/>
         </w:rPr>
         <w:t>云计算技术</w:t>
       </w:r>
       <w:r>
         <w:rPr>
-          <w:rFonts w:ascii="微软雅黑" w:eastAsia="微软雅黑" w:hAnsi="微软雅黑" w:hint="eastAsia"/>
+          <w:rFonts w:ascii="Microsoft YaHei" w:eastAsia="Microsoft YaHei" w:hAnsi="Microsoft YaHei" w:hint="eastAsia"/>
           <w:sz w:val="36"/>
         </w:rPr>
         <w:t>实验</w:t>
@@ -46,60 +46,68 @@
     </w:p>
     <w:p>
       <w:pPr>
-        <w:pStyle w:val="a7"/>
+        <w:pStyle w:val="Title"/>
         <w:pBdr>
           <w:bottom w:val="single" w:sz="8" w:space="13" w:color="4F81BD"/>
         </w:pBdr>
         <w:adjustRightInd w:val="0"/>
         <w:spacing w:after="0"/>
         <w:rPr>
-          <w:rFonts w:ascii="微软雅黑" w:eastAsia="微软雅黑" w:hAnsi="微软雅黑" w:hint="eastAsia"/>
+          <w:rFonts w:ascii="Microsoft YaHei" w:eastAsia="Microsoft YaHei" w:hAnsi="Microsoft YaHei"/>
           <w:sz w:val="36"/>
           <w:szCs w:val="36"/>
         </w:rPr>
       </w:pPr>
       <w:r>
         <w:rPr>
-          <w:rFonts w:ascii="微软雅黑" w:eastAsia="微软雅黑" w:hAnsi="微软雅黑" w:hint="eastAsia"/>
+          <w:rFonts w:ascii="Microsoft YaHei" w:eastAsia="Microsoft YaHei" w:hAnsi="Microsoft YaHei"/>
           <w:sz w:val="36"/>
           <w:szCs w:val="36"/>
         </w:rPr>
-        <w:t>第六</w:t>
-      </w:r>
-      <w:r>
-        <w:rPr>
-          <w:rFonts w:ascii="微软雅黑" w:eastAsia="微软雅黑" w:hAnsi="微软雅黑"/>
+        <w:t>第</w:t>
+      </w:r>
+      <w:r>
+        <w:rPr>
+          <w:rFonts w:ascii="Microsoft YaHei" w:eastAsia="Microsoft YaHei" w:hAnsi="Microsoft YaHei" w:hint="eastAsia"/>
           <w:sz w:val="36"/>
           <w:szCs w:val="36"/>
         </w:rPr>
-        <w:t>次</w:t>
-      </w:r>
-      <w:r>
-        <w:rPr>
-          <w:rFonts w:ascii="微软雅黑" w:eastAsia="微软雅黑" w:hAnsi="微软雅黑" w:hint="eastAsia"/>
+        <w:t>六</w:t>
+      </w:r>
+      <w:r>
+        <w:rPr>
+          <w:rFonts w:ascii="Microsoft YaHei" w:eastAsia="Microsoft YaHei" w:hAnsi="Microsoft YaHei"/>
           <w:sz w:val="36"/>
           <w:szCs w:val="36"/>
         </w:rPr>
+        <w:t>次</w:t>
+      </w:r>
+      <w:r>
+        <w:rPr>
+          <w:rFonts w:ascii="Microsoft YaHei" w:eastAsia="Microsoft YaHei" w:hAnsi="Microsoft YaHei" w:hint="eastAsia"/>
+          <w:sz w:val="36"/>
+          <w:szCs w:val="36"/>
+        </w:rPr>
         <w:t>实验</w:t>
       </w:r>
     </w:p>
     <w:p>
       <w:pPr>
-        <w:pStyle w:val="a7"/>
+        <w:pStyle w:val="Title"/>
         <w:pBdr>
           <w:bottom w:val="single" w:sz="8" w:space="13" w:color="4F81BD"/>
         </w:pBdr>
         <w:adjustRightInd w:val="0"/>
         <w:spacing w:after="0"/>
         <w:rPr>
-          <w:rFonts w:ascii="微软雅黑" w:eastAsia="微软雅黑" w:hAnsi="微软雅黑" w:hint="eastAsia"/>
+          <w:rFonts w:ascii="Microsoft YaHei" w:eastAsia="Microsoft YaHei" w:hAnsi="Microsoft YaHei"/>
           <w:sz w:val="36"/>
           <w:szCs w:val="36"/>
         </w:rPr>
       </w:pPr>
       <w:r>
         <w:rPr>
-          <w:rFonts w:ascii="微软雅黑" w:eastAsia="微软雅黑" w:hAnsi="微软雅黑"/>
+          <w:rFonts w:ascii="Microsoft YaHei" w:eastAsia="Microsoft YaHei" w:hAnsi="Microsoft YaHei"/>
           <w:sz w:val="36"/>
           <w:szCs w:val="36"/>
         </w:rPr>
@@ -107,7 +115,7 @@
       </w:r>
       <w:r>
         <w:rPr>
-          <w:rFonts w:ascii="微软雅黑" w:eastAsia="微软雅黑" w:hAnsi="微软雅黑"/>
+          <w:rFonts w:ascii="Microsoft YaHei" w:eastAsia="Microsoft YaHei" w:hAnsi="Microsoft YaHei"/>
           <w:sz w:val="36"/>
           <w:szCs w:val="36"/>
         </w:rPr>
@@ -115,7 +123,7 @@
       </w:r>
       <w:r>
         <w:rPr>
-          <w:rFonts w:ascii="微软雅黑" w:eastAsia="微软雅黑" w:hAnsi="微软雅黑"/>
+          <w:rFonts w:ascii="Microsoft YaHei" w:eastAsia="Microsoft YaHei" w:hAnsi="Microsoft YaHei"/>
           <w:sz w:val="36"/>
           <w:szCs w:val="36"/>
         </w:rPr>
@@ -123,71 +131,95 @@
       </w:r>
       <w:r>
         <w:rPr>
-          <w:rFonts w:ascii="微软雅黑" w:eastAsia="微软雅黑" w:hAnsi="微软雅黑" w:hint="eastAsia"/>
+          <w:rFonts w:ascii="Microsoft YaHei" w:eastAsia="Microsoft YaHei" w:hAnsi="Microsoft YaHei" w:hint="eastAsia"/>
           <w:sz w:val="36"/>
           <w:szCs w:val="36"/>
         </w:rPr>
-        <w:t>25</w:t>
-      </w:r>
-      <w:r>
-        <w:rPr>
-          <w:rFonts w:ascii="微软雅黑" w:eastAsia="微软雅黑" w:hAnsi="微软雅黑"/>
+        <w:t>2</w:t>
+      </w:r>
+      <w:r>
+        <w:rPr>
+          <w:rFonts w:ascii="Microsoft YaHei" w:eastAsia="Microsoft YaHei" w:hAnsi="Microsoft YaHei" w:hint="eastAsia"/>
           <w:sz w:val="36"/>
           <w:szCs w:val="36"/>
         </w:rPr>
-        <w:t>年</w:t>
-      </w:r>
-      <w:r>
-        <w:rPr>
-          <w:rFonts w:ascii="微软雅黑" w:eastAsia="微软雅黑" w:hAnsi="微软雅黑" w:hint="eastAsia"/>
+        <w:t>6</w:t>
+      </w:r>
+      <w:r>
+        <w:rPr>
+          <w:rFonts w:ascii="Microsoft YaHei" w:eastAsia="Microsoft YaHei" w:hAnsi="Microsoft YaHei"/>
           <w:sz w:val="36"/>
           <w:szCs w:val="36"/>
         </w:rPr>
-        <w:t>0</w:t>
-      </w:r>
-      <w:r>
-        <w:rPr>
-          <w:rFonts w:ascii="微软雅黑" w:eastAsia="微软雅黑" w:hAnsi="微软雅黑" w:hint="eastAsia"/>
+        <w:t>年</w:t>
+      </w:r>
+      <w:r>
+        <w:rPr>
+          <w:rFonts w:ascii="Microsoft YaHei" w:eastAsia="Microsoft YaHei" w:hAnsi="Microsoft YaHei" w:hint="eastAsia"/>
           <w:sz w:val="36"/>
           <w:szCs w:val="36"/>
         </w:rPr>
-        <w:t>6</w:t>
-      </w:r>
-      <w:r>
-        <w:rPr>
-          <w:rFonts w:ascii="微软雅黑" w:eastAsia="微软雅黑" w:hAnsi="微软雅黑"/>
+        <w:t>0</w:t>
+      </w:r>
+      <w:r>
+        <w:rPr>
+          <w:rFonts w:ascii="Microsoft YaHei" w:eastAsia="Microsoft YaHei" w:hAnsi="Microsoft YaHei" w:hint="eastAsia"/>
           <w:sz w:val="36"/>
           <w:szCs w:val="36"/>
         </w:rPr>
-        <w:t>月</w:t>
-      </w:r>
-      <w:r>
-        <w:rPr>
-          <w:rFonts w:ascii="微软雅黑" w:eastAsia="微软雅黑" w:hAnsi="微软雅黑" w:hint="eastAsia"/>
+        <w:t>6</w:t>
+      </w:r>
+      <w:r>
+        <w:rPr>
+          <w:rFonts w:ascii="Microsoft YaHei" w:eastAsia="Microsoft YaHei" w:hAnsi="Microsoft YaHei"/>
           <w:sz w:val="36"/>
           <w:szCs w:val="36"/>
         </w:rPr>
-        <w:t>25</w:t>
-      </w:r>
-      <w:r>
-        <w:rPr>
-          <w:rFonts w:ascii="微软雅黑" w:eastAsia="微软雅黑" w:hAnsi="微软雅黑"/>
+        <w:t>月</w:t>
+      </w:r>
+      <w:r>
+        <w:rPr>
+          <w:rFonts w:ascii="Microsoft YaHei" w:eastAsia="Microsoft YaHei" w:hAnsi="Microsoft YaHei" w:hint="eastAsia"/>
           <w:sz w:val="36"/>
           <w:szCs w:val="36"/>
         </w:rPr>
-        <w:t>日（周三）11:59pm</w:t>
-      </w:r>
-    </w:p>
-    <w:p>
-      <w:pPr>
-        <w:pStyle w:val="a7"/>
+        <w:t>23</w:t>
+      </w:r>
+      <w:r>
+        <w:rPr>
+          <w:rFonts w:ascii="Microsoft YaHei" w:eastAsia="Microsoft YaHei" w:hAnsi="Microsoft YaHei"/>
+          <w:sz w:val="36"/>
+          <w:szCs w:val="36"/>
+        </w:rPr>
+        <w:t>日（周</w:t>
+      </w:r>
+      <w:r>
+        <w:rPr>
+          <w:rFonts w:ascii="Microsoft YaHei" w:eastAsia="Microsoft YaHei" w:hAnsi="Microsoft YaHei" w:hint="eastAsia"/>
+          <w:sz w:val="36"/>
+          <w:szCs w:val="36"/>
+        </w:rPr>
+        <w:t>二</w:t>
+      </w:r>
+      <w:r>
+        <w:rPr>
+          <w:rFonts w:ascii="Microsoft YaHei" w:eastAsia="Microsoft YaHei" w:hAnsi="Microsoft YaHei"/>
+          <w:sz w:val="36"/>
+          <w:szCs w:val="36"/>
+        </w:rPr>
+        <w:t>）11:59pm</w:t>
+      </w:r>
+    </w:p>
+    <w:p>
+      <w:pPr>
+        <w:pStyle w:val="Title"/>
         <w:pBdr>
           <w:bottom w:val="single" w:sz="8" w:space="13" w:color="4F81BD"/>
         </w:pBdr>
         <w:adjustRightInd w:val="0"/>
         <w:spacing w:after="0" w:line="80" w:lineRule="atLeast"/>
         <w:rPr>
-          <w:rFonts w:ascii="微软雅黑" w:eastAsia="微软雅黑" w:hAnsi="微软雅黑" w:hint="eastAsia"/>
+          <w:rFonts w:ascii="Microsoft YaHei" w:eastAsia="Microsoft YaHei" w:hAnsi="Microsoft YaHei"/>
           <w:b w:val="0"/>
           <w:bCs w:val="0"/>
           <w:color w:val="44546A" w:themeColor="text2"/>
@@ -197,40 +229,53 @@
       </w:pPr>
       <w:r>
         <w:rPr>
-          <w:rFonts w:ascii="微软雅黑" w:eastAsia="微软雅黑" w:hAnsi="微软雅黑"/>
+          <w:rFonts w:ascii="Microsoft YaHei" w:eastAsia="Microsoft YaHei" w:hAnsi="Microsoft YaHei"/>
           <w:b w:val="0"/>
           <w:bCs w:val="0"/>
           <w:color w:val="44546A" w:themeColor="text2"/>
           <w:sz w:val="26"/>
           <w:szCs w:val="26"/>
         </w:rPr>
-        <w:t>将</w:t>
-      </w:r>
-      <w:r>
-        <w:rPr>
-          <w:rFonts w:ascii="微软雅黑" w:eastAsia="微软雅黑" w:hAnsi="微软雅黑"/>
+        <w:t>作业</w:t>
+      </w:r>
+      <w:r>
+        <w:rPr>
+          <w:rFonts w:ascii="Microsoft YaHei" w:eastAsia="Microsoft YaHei" w:hAnsi="Microsoft YaHei" w:hint="eastAsia"/>
           <w:b w:val="0"/>
           <w:bCs w:val="0"/>
           <w:color w:val="44546A" w:themeColor="text2"/>
           <w:sz w:val="26"/>
           <w:szCs w:val="26"/>
         </w:rPr>
-        <w:t>作业</w:t>
-      </w:r>
-      <w:r>
-        <w:rPr>
-          <w:rFonts w:ascii="微软雅黑" w:eastAsia="微软雅黑" w:hAnsi="微软雅黑"/>
+        <w:t>提交到：</w:t>
+      </w:r>
+      <w:hyperlink r:id="rId7" w:history="1">
+        <w:r>
+          <w:rPr>
+            <w:rStyle w:val="Hyperlink"/>
+            <w:rFonts w:ascii="Microsoft YaHei" w:eastAsia="Microsoft YaHei" w:hAnsi="Microsoft YaHei"/>
+            <w:b w:val="0"/>
+            <w:bCs w:val="0"/>
+            <w:sz w:val="26"/>
+            <w:szCs w:val="26"/>
+          </w:rPr>
+          <w:t>https://docs.qq.com/form/page/DSmF6TWFGY1NjRG9D</w:t>
+        </w:r>
+      </w:hyperlink>
+      <w:r>
+        <w:rPr>
+          <w:rFonts w:ascii="Microsoft YaHei" w:eastAsia="Microsoft YaHei" w:hAnsi="Microsoft YaHei" w:hint="eastAsia"/>
           <w:b w:val="0"/>
           <w:bCs w:val="0"/>
           <w:color w:val="44546A" w:themeColor="text2"/>
           <w:sz w:val="26"/>
           <w:szCs w:val="26"/>
         </w:rPr>
-        <w:t>以</w:t>
-      </w:r>
-      <w:r>
-        <w:rPr>
-          <w:rFonts w:ascii="微软雅黑" w:eastAsia="微软雅黑" w:hAnsi="微软雅黑"/>
+        <w:t xml:space="preserve"> </w:t>
+      </w:r>
+      <w:r>
+        <w:rPr>
+          <w:rFonts w:ascii="Microsoft YaHei" w:eastAsia="Microsoft YaHei" w:hAnsi="Microsoft YaHei" w:hint="eastAsia"/>
           <w:b w:val="0"/>
           <w:bCs w:val="0"/>
           <w:color w:val="44546A" w:themeColor="text2"/>
@@ -241,221 +286,172 @@
       </w:r>
       <w:r>
         <w:rPr>
-          <w:rFonts w:ascii="微软雅黑" w:eastAsia="微软雅黑" w:hAnsi="微软雅黑"/>
+          <w:rFonts w:ascii="Microsoft YaHei" w:eastAsia="Microsoft YaHei" w:hAnsi="Microsoft YaHei" w:hint="eastAsia"/>
           <w:b w:val="0"/>
           <w:bCs w:val="0"/>
           <w:color w:val="44546A" w:themeColor="text2"/>
           <w:sz w:val="26"/>
           <w:szCs w:val="26"/>
         </w:rPr>
-        <w:t>PDF</w:t>
-      </w:r>
-      <w:r>
-        <w:rPr>
-          <w:rFonts w:ascii="微软雅黑" w:eastAsia="微软雅黑" w:hAnsi="微软雅黑"/>
+        <w:t xml:space="preserve"> </w:t>
+      </w:r>
+      <w:r>
+        <w:rPr>
+          <w:rFonts w:ascii="Microsoft YaHei" w:eastAsia="Microsoft YaHei" w:hAnsi="Microsoft YaHei"/>
+          <w:b w:val="0"/>
+          <w:bCs w:val="0"/>
+          <w:color w:val="44546A" w:themeColor="text2"/>
+          <w:sz w:val="24"/>
+          <w:szCs w:val="24"/>
+        </w:rPr>
+        <w:t xml:space="preserve"> </w:t>
+      </w:r>
+    </w:p>
+    <w:p>
+      <w:pPr>
+        <w:pStyle w:val="Title"/>
+        <w:pBdr>
+          <w:bottom w:val="single" w:sz="8" w:space="13" w:color="4F81BD"/>
+        </w:pBdr>
+        <w:adjustRightInd w:val="0"/>
+        <w:spacing w:after="0" w:line="80" w:lineRule="atLeast"/>
+        <w:rPr>
+          <w:rFonts w:ascii="Microsoft YaHei" w:eastAsia="Microsoft YaHei" w:hAnsi="Microsoft YaHei"/>
+          <w:b w:val="0"/>
+          <w:bCs w:val="0"/>
+        </w:rPr>
+      </w:pPr>
+      <w:r>
+        <w:rPr>
+          <w:rFonts w:ascii="Microsoft YaHei" w:eastAsia="Microsoft YaHei" w:hAnsi="Microsoft YaHei"/>
           <w:b w:val="0"/>
           <w:bCs w:val="0"/>
           <w:color w:val="44546A" w:themeColor="text2"/>
           <w:sz w:val="26"/>
           <w:szCs w:val="26"/>
         </w:rPr>
-        <w:t xml:space="preserve"> </w:t>
-      </w:r>
-      <w:r>
-        <w:rPr>
-          <w:rFonts w:ascii="微软雅黑" w:eastAsia="微软雅黑" w:hAnsi="微软雅黑"/>
+        <w:t>邮件及文件</w:t>
+      </w:r>
+      <w:r>
+        <w:rPr>
+          <w:rFonts w:ascii="Microsoft YaHei" w:eastAsia="Microsoft YaHei" w:hAnsi="Microsoft YaHei"/>
           <w:b w:val="0"/>
           <w:bCs w:val="0"/>
           <w:color w:val="44546A" w:themeColor="text2"/>
           <w:sz w:val="26"/>
           <w:szCs w:val="26"/>
         </w:rPr>
-        <w:t>的格式</w:t>
-      </w:r>
-      <w:r>
-        <w:rPr>
-          <w:rFonts w:ascii="微软雅黑" w:eastAsia="微软雅黑" w:hAnsi="微软雅黑"/>
+        <w:t>命名</w:t>
+      </w:r>
+      <w:r>
+        <w:rPr>
+          <w:rFonts w:ascii="Microsoft YaHei" w:eastAsia="Microsoft YaHei" w:hAnsi="Microsoft YaHei"/>
           <w:b w:val="0"/>
           <w:bCs w:val="0"/>
           <w:color w:val="44546A" w:themeColor="text2"/>
           <w:sz w:val="26"/>
           <w:szCs w:val="26"/>
         </w:rPr>
-        <w:t>发送到</w:t>
-      </w:r>
-      <w:r>
-        <w:rPr>
-          <w:rFonts w:ascii="微软雅黑" w:eastAsia="微软雅黑" w:hAnsi="微软雅黑" w:hint="eastAsia"/>
+        <w:t>为</w:t>
+      </w:r>
+      <w:r>
+        <w:rPr>
+          <w:rFonts w:ascii="Microsoft YaHei" w:eastAsia="Microsoft YaHei" w:hAnsi="Microsoft YaHei"/>
           <w:b w:val="0"/>
           <w:bCs w:val="0"/>
           <w:color w:val="44546A" w:themeColor="text2"/>
           <w:sz w:val="26"/>
           <w:szCs w:val="26"/>
         </w:rPr>
-        <w:t>：</w:t>
-      </w:r>
-      <w:hyperlink r:id="rId7" w:history="1">
-        <w:r>
-          <w:rPr>
-            <w:rStyle w:val="a4"/>
-            <w:rFonts w:ascii="微软雅黑" w:eastAsia="微软雅黑" w:hAnsi="微软雅黑" w:hint="eastAsia"/>
-            <w:b w:val="0"/>
-            <w:bCs w:val="0"/>
-            <w:sz w:val="26"/>
-            <w:szCs w:val="26"/>
-          </w:rPr>
-          <w:t>dengzl11@163.com</w:t>
-        </w:r>
-      </w:hyperlink>
-    </w:p>
-    <w:p>
-      <w:pPr>
-        <w:pStyle w:val="a7"/>
-        <w:pBdr>
-          <w:bottom w:val="single" w:sz="8" w:space="13" w:color="4F81BD"/>
-        </w:pBdr>
-        <w:adjustRightInd w:val="0"/>
-        <w:spacing w:after="0" w:line="80" w:lineRule="atLeast"/>
-        <w:rPr>
-          <w:rFonts w:ascii="微软雅黑" w:eastAsia="微软雅黑" w:hAnsi="微软雅黑" w:hint="eastAsia"/>
-          <w:b w:val="0"/>
-          <w:bCs w:val="0"/>
-        </w:rPr>
-      </w:pPr>
-      <w:r>
-        <w:rPr>
-          <w:rFonts w:ascii="微软雅黑" w:eastAsia="微软雅黑" w:hAnsi="微软雅黑"/>
+        <w:t>“</w:t>
+      </w:r>
+      <w:r>
+        <w:rPr>
+          <w:rFonts w:ascii="Microsoft YaHei" w:eastAsia="Microsoft YaHei" w:hAnsi="Microsoft YaHei" w:hint="eastAsia"/>
           <w:b w:val="0"/>
           <w:bCs w:val="0"/>
           <w:color w:val="44546A" w:themeColor="text2"/>
           <w:sz w:val="26"/>
           <w:szCs w:val="26"/>
         </w:rPr>
-        <w:t>邮件及文件</w:t>
-      </w:r>
-      <w:r>
-        <w:rPr>
-          <w:rFonts w:ascii="微软雅黑" w:eastAsia="微软雅黑" w:hAnsi="微软雅黑"/>
+        <w:t>姓名-学号-</w:t>
+      </w:r>
+      <w:r>
+        <w:rPr>
+          <w:rFonts w:ascii="Microsoft YaHei" w:eastAsia="Microsoft YaHei" w:hAnsi="Microsoft YaHei" w:hint="eastAsia"/>
           <w:b w:val="0"/>
           <w:bCs w:val="0"/>
           <w:color w:val="44546A" w:themeColor="text2"/>
           <w:sz w:val="26"/>
           <w:szCs w:val="26"/>
         </w:rPr>
-        <w:t>命名</w:t>
-      </w:r>
-      <w:r>
-        <w:rPr>
-          <w:rFonts w:ascii="微软雅黑" w:eastAsia="微软雅黑" w:hAnsi="微软雅黑"/>
+        <w:t>云计算技术实验</w:t>
+      </w:r>
+      <w:r>
+        <w:rPr>
+          <w:rFonts w:ascii="Microsoft YaHei" w:eastAsia="Microsoft YaHei" w:hAnsi="Microsoft YaHei" w:hint="eastAsia"/>
           <w:b w:val="0"/>
           <w:bCs w:val="0"/>
           <w:color w:val="44546A" w:themeColor="text2"/>
           <w:sz w:val="26"/>
           <w:szCs w:val="26"/>
         </w:rPr>
-        <w:t>为</w:t>
-      </w:r>
-      <w:r>
-        <w:rPr>
-          <w:rFonts w:ascii="微软雅黑" w:eastAsia="微软雅黑" w:hAnsi="微软雅黑"/>
+        <w:t>6</w:t>
+      </w:r>
+      <w:r>
+        <w:rPr>
+          <w:rFonts w:ascii="Microsoft YaHei" w:eastAsia="Microsoft YaHei" w:hAnsi="Microsoft YaHei"/>
           <w:b w:val="0"/>
           <w:bCs w:val="0"/>
           <w:color w:val="44546A" w:themeColor="text2"/>
           <w:sz w:val="26"/>
           <w:szCs w:val="26"/>
         </w:rPr>
-        <w:t>“</w:t>
-      </w:r>
-      <w:r>
-        <w:rPr>
-          <w:rFonts w:ascii="微软雅黑" w:eastAsia="微软雅黑" w:hAnsi="微软雅黑" w:hint="eastAsia"/>
+        <w:t>.pdf</w:t>
+      </w:r>
+      <w:r>
+        <w:rPr>
+          <w:rFonts w:ascii="Microsoft YaHei" w:eastAsia="Microsoft YaHei" w:hAnsi="Microsoft YaHei"/>
           <w:b w:val="0"/>
           <w:bCs w:val="0"/>
           <w:color w:val="44546A" w:themeColor="text2"/>
           <w:sz w:val="26"/>
           <w:szCs w:val="26"/>
         </w:rPr>
-        <w:t>姓名-学号-第</w:t>
-      </w:r>
-      <w:r>
-        <w:rPr>
-          <w:rFonts w:ascii="微软雅黑" w:eastAsia="微软雅黑" w:hAnsi="微软雅黑" w:hint="eastAsia"/>
-          <w:b w:val="0"/>
-          <w:bCs w:val="0"/>
-          <w:color w:val="44546A" w:themeColor="text2"/>
-          <w:sz w:val="26"/>
-          <w:szCs w:val="26"/>
-        </w:rPr>
-        <w:t>六</w:t>
-      </w:r>
-      <w:r>
-        <w:rPr>
-          <w:rFonts w:ascii="微软雅黑" w:eastAsia="微软雅黑" w:hAnsi="微软雅黑" w:hint="eastAsia"/>
-          <w:b w:val="0"/>
-          <w:bCs w:val="0"/>
-          <w:color w:val="44546A" w:themeColor="text2"/>
-          <w:sz w:val="26"/>
-          <w:szCs w:val="26"/>
-        </w:rPr>
-        <w:t>次</w:t>
-      </w:r>
-      <w:r>
-        <w:rPr>
-          <w:rFonts w:ascii="微软雅黑" w:eastAsia="微软雅黑" w:hAnsi="微软雅黑" w:hint="eastAsia"/>
-          <w:b w:val="0"/>
-          <w:bCs w:val="0"/>
-          <w:color w:val="44546A" w:themeColor="text2"/>
-          <w:sz w:val="26"/>
-          <w:szCs w:val="26"/>
-        </w:rPr>
-        <w:t>实验</w:t>
-      </w:r>
-      <w:r>
-        <w:rPr>
-          <w:rFonts w:ascii="微软雅黑" w:eastAsia="微软雅黑" w:hAnsi="微软雅黑"/>
-          <w:b w:val="0"/>
-          <w:bCs w:val="0"/>
-          <w:color w:val="44546A" w:themeColor="text2"/>
-          <w:sz w:val="26"/>
-          <w:szCs w:val="26"/>
-        </w:rPr>
-        <w:t>.pdf</w:t>
-      </w:r>
-      <w:r>
-        <w:rPr>
-          <w:rFonts w:ascii="微软雅黑" w:eastAsia="微软雅黑" w:hAnsi="微软雅黑"/>
-          <w:b w:val="0"/>
-          <w:bCs w:val="0"/>
-          <w:color w:val="44546A" w:themeColor="text2"/>
-          <w:sz w:val="26"/>
-          <w:szCs w:val="26"/>
-        </w:rPr>
         <w:t>”</w:t>
       </w:r>
     </w:p>
     <w:p>
       <w:pPr>
         <w:rPr>
-          <w:rFonts w:ascii="Microsoft YaHei UI" w:eastAsia="Microsoft YaHei UI" w:hAnsi="Microsoft YaHei UI" w:hint="eastAsia"/>
+          <w:rFonts w:ascii="Microsoft YaHei" w:eastAsia="Microsoft YaHei" w:hAnsi="Microsoft YaHei"/>
           <w:lang w:val="en-US"/>
         </w:rPr>
       </w:pPr>
     </w:p>
     <w:p>
       <w:pPr>
+        <w:rPr>
+          <w:rFonts w:ascii="Microsoft YaHei UI" w:eastAsia="Microsoft YaHei UI" w:hAnsi="Microsoft YaHei UI"/>
+          <w:b/>
+          <w:bCs/>
+        </w:rPr>
+      </w:pPr>
+      <w:r>
         <w:rPr>
           <w:rFonts w:ascii="Microsoft YaHei UI" w:eastAsia="Microsoft YaHei UI" w:hAnsi="Microsoft YaHei UI" w:hint="eastAsia"/>
           <w:b/>
           <w:bCs/>
         </w:rPr>
-      </w:pPr>
+        <w:t xml:space="preserve">任务一 </w:t>
+      </w:r>
       <w:r>
         <w:rPr>
           <w:rFonts w:ascii="Microsoft YaHei UI" w:eastAsia="Microsoft YaHei UI" w:hAnsi="Microsoft YaHei UI" w:hint="eastAsia"/>
           <w:b/>
           <w:bCs/>
         </w:rPr>
-        <w:t>任务</w:t>
+        <w:t>(</w:t>
       </w:r>
       <w:r>
         <w:rPr>
@@ -463,51 +459,123 @@
           <w:b/>
           <w:bCs/>
         </w:rPr>
-        <w:t xml:space="preserve">一 </w:t>
-      </w:r>
-    </w:p>
-    <w:p>
-      <w:pPr>
-        <w:rPr>
-          <w:rFonts w:ascii="Microsoft YaHei UI" w:eastAsia="Microsoft YaHei UI" w:hAnsi="Microsoft YaHei UI" w:hint="eastAsia"/>
-        </w:rPr>
-      </w:pPr>
-    </w:p>
-    <w:p>
-      <w:pPr>
-        <w:rPr>
-          <w:rFonts w:ascii="Microsoft YaHei UI" w:eastAsia="Microsoft YaHei UI" w:hAnsi="Microsoft YaHei UI" w:hint="eastAsia"/>
-        </w:rPr>
-      </w:pPr>
-    </w:p>
-    <w:p>
-      <w:pPr>
-        <w:rPr>
-          <w:rFonts w:ascii="Microsoft YaHei UI" w:eastAsia="Microsoft YaHei UI" w:hAnsi="Microsoft YaHei UI" w:hint="eastAsia"/>
-        </w:rPr>
-      </w:pPr>
-    </w:p>
-    <w:p>
-      <w:pPr>
-        <w:rPr>
-          <w:rFonts w:ascii="Microsoft YaHei UI" w:eastAsia="Microsoft YaHei UI" w:hAnsi="Microsoft YaHei UI" w:hint="eastAsia"/>
-        </w:rPr>
-      </w:pPr>
-    </w:p>
-    <w:p>
-      <w:pPr>
-        <w:rPr>
-          <w:rFonts w:ascii="Microsoft YaHei UI" w:eastAsia="Microsoft YaHei UI" w:hAnsi="Microsoft YaHei UI" w:hint="eastAsia"/>
-        </w:rPr>
-      </w:pPr>
-    </w:p>
-    <w:p>
-      <w:pPr>
+        <w:t>25</w:t>
+      </w:r>
+      <w:r>
         <w:rPr>
           <w:rFonts w:ascii="Microsoft YaHei UI" w:eastAsia="Microsoft YaHei UI" w:hAnsi="Microsoft YaHei UI" w:hint="eastAsia"/>
           <w:b/>
           <w:bCs/>
         </w:rPr>
+        <w:t>分</w:t>
+      </w:r>
+      <w:r>
+        <w:rPr>
+          <w:rFonts w:ascii="Microsoft YaHei UI" w:eastAsia="Microsoft YaHei UI" w:hAnsi="Microsoft YaHei UI"/>
+          <w:b/>
+          <w:bCs/>
+        </w:rPr>
+        <w:t xml:space="preserve">) </w:t>
+      </w:r>
+    </w:p>
+    <w:p>
+      <w:pPr>
+        <w:rPr>
+          <w:rFonts w:ascii="Microsoft YaHei UI" w:eastAsia="Microsoft YaHei UI" w:hAnsi="Microsoft YaHei UI"/>
+        </w:rPr>
+      </w:pPr>
+    </w:p>
+    <w:p>
+      <w:pPr>
+        <w:rPr>
+          <w:rFonts w:ascii="Microsoft YaHei UI" w:eastAsia="Microsoft YaHei UI" w:hAnsi="Microsoft YaHei UI"/>
+        </w:rPr>
+      </w:pPr>
+    </w:p>
+    <w:p>
+      <w:pPr>
+        <w:rPr>
+          <w:rFonts w:ascii="Microsoft YaHei UI" w:eastAsia="Microsoft YaHei UI" w:hAnsi="Microsoft YaHei UI"/>
+        </w:rPr>
+      </w:pPr>
+    </w:p>
+    <w:p>
+      <w:pPr>
+        <w:rPr>
+          <w:rFonts w:ascii="Microsoft YaHei UI" w:eastAsia="Microsoft YaHei UI" w:hAnsi="Microsoft YaHei UI"/>
+        </w:rPr>
+      </w:pPr>
+    </w:p>
+    <w:p>
+      <w:pPr>
+        <w:rPr>
+          <w:rFonts w:ascii="Microsoft YaHei UI" w:eastAsia="Microsoft YaHei UI" w:hAnsi="Microsoft YaHei UI"/>
+        </w:rPr>
+      </w:pPr>
+    </w:p>
+    <w:p>
+      <w:pPr>
+        <w:rPr>
+          <w:rFonts w:ascii="Microsoft YaHei UI" w:eastAsia="Microsoft YaHei UI" w:hAnsi="Microsoft YaHei UI"/>
+        </w:rPr>
+      </w:pPr>
+    </w:p>
+    <w:p>
+      <w:pPr>
+        <w:rPr>
+          <w:rFonts w:ascii="Microsoft YaHei UI" w:eastAsia="Microsoft YaHei UI" w:hAnsi="Microsoft YaHei UI"/>
+        </w:rPr>
+      </w:pPr>
+    </w:p>
+    <w:p>
+      <w:pPr>
+        <w:rPr>
+          <w:rFonts w:ascii="Microsoft YaHei UI" w:eastAsia="Microsoft YaHei UI" w:hAnsi="Microsoft YaHei UI"/>
+        </w:rPr>
+      </w:pPr>
+    </w:p>
+    <w:p>
+      <w:pPr>
+        <w:rPr>
+          <w:rFonts w:ascii="Microsoft YaHei UI" w:eastAsia="Microsoft YaHei UI" w:hAnsi="Microsoft YaHei UI"/>
+        </w:rPr>
+      </w:pPr>
+    </w:p>
+    <w:p>
+      <w:pPr>
+        <w:rPr>
+          <w:rFonts w:ascii="Microsoft YaHei UI" w:eastAsia="Microsoft YaHei UI" w:hAnsi="Microsoft YaHei UI" w:hint="eastAsia"/>
+        </w:rPr>
+      </w:pPr>
+    </w:p>
+    <w:p>
+      <w:pPr>
+        <w:rPr>
+          <w:rFonts w:ascii="Microsoft YaHei UI" w:eastAsia="Microsoft YaHei UI" w:hAnsi="Microsoft YaHei UI"/>
+        </w:rPr>
+      </w:pPr>
+    </w:p>
+    <w:p>
+      <w:pPr>
+        <w:rPr>
+          <w:rFonts w:ascii="Microsoft YaHei UI" w:eastAsia="Microsoft YaHei UI" w:hAnsi="Microsoft YaHei UI"/>
+        </w:rPr>
+      </w:pPr>
+    </w:p>
+    <w:p>
+      <w:pPr>
+        <w:rPr>
+          <w:rFonts w:ascii="Microsoft YaHei UI" w:eastAsia="Microsoft YaHei UI" w:hAnsi="Microsoft YaHei UI"/>
+        </w:rPr>
+      </w:pPr>
+    </w:p>
+    <w:p>
+      <w:pPr>
+        <w:rPr>
+          <w:rFonts w:ascii="Microsoft YaHei UI" w:eastAsia="Microsoft YaHei UI" w:hAnsi="Microsoft YaHei UI"/>
+          <w:b/>
+          <w:bCs/>
+        </w:rPr>
       </w:pPr>
       <w:r>
         <w:rPr>
@@ -527,11 +595,369 @@
       </w:r>
       <w:r>
         <w:rPr>
-          <w:rFonts w:ascii="Microsoft YaHei UI" w:eastAsia="Microsoft YaHei UI" w:hAnsi="Microsoft YaHei UI"/>
+          <w:rFonts w:ascii="Microsoft YaHei UI" w:eastAsia="Microsoft YaHei UI" w:hAnsi="Microsoft YaHei UI" w:hint="eastAsia"/>
           <w:b/>
           <w:bCs/>
         </w:rPr>
+        <w:t xml:space="preserve"> (</w:t>
+      </w:r>
+      <w:r>
+        <w:rPr>
+          <w:rFonts w:ascii="Microsoft YaHei UI" w:eastAsia="Microsoft YaHei UI" w:hAnsi="Microsoft YaHei UI" w:hint="eastAsia"/>
+          <w:b/>
+          <w:bCs/>
+        </w:rPr>
+        <w:t>25</w:t>
+      </w:r>
+      <w:r>
+        <w:rPr>
+          <w:rFonts w:ascii="Microsoft YaHei UI" w:eastAsia="Microsoft YaHei UI" w:hAnsi="Microsoft YaHei UI" w:hint="eastAsia"/>
+          <w:b/>
+          <w:bCs/>
+        </w:rPr>
+        <w:t>分</w:t>
+      </w:r>
+      <w:r>
+        <w:rPr>
+          <w:rFonts w:ascii="Microsoft YaHei UI" w:eastAsia="Microsoft YaHei UI" w:hAnsi="Microsoft YaHei UI"/>
+          <w:b/>
+          <w:bCs/>
+        </w:rPr>
+        <w:t xml:space="preserve">) </w:t>
+      </w:r>
+    </w:p>
+    <w:p>
+      <w:pPr>
+        <w:rPr>
+          <w:rFonts w:ascii="Microsoft YaHei UI" w:eastAsia="Microsoft YaHei UI" w:hAnsi="Microsoft YaHei UI"/>
+          <w:b/>
+          <w:bCs/>
+        </w:rPr>
+      </w:pPr>
+    </w:p>
+    <w:p>
+      <w:pPr>
+        <w:rPr>
+          <w:rFonts w:ascii="Microsoft YaHei UI" w:eastAsia="Microsoft YaHei UI" w:hAnsi="Microsoft YaHei UI"/>
+          <w:b/>
+          <w:bCs/>
+        </w:rPr>
+      </w:pPr>
+    </w:p>
+    <w:p>
+      <w:pPr>
+        <w:rPr>
+          <w:rFonts w:ascii="Microsoft YaHei UI" w:eastAsia="Microsoft YaHei UI" w:hAnsi="Microsoft YaHei UI"/>
+          <w:b/>
+          <w:bCs/>
+        </w:rPr>
+      </w:pPr>
+    </w:p>
+    <w:p>
+      <w:pPr>
+        <w:rPr>
+          <w:rFonts w:ascii="Microsoft YaHei UI" w:eastAsia="Microsoft YaHei UI" w:hAnsi="Microsoft YaHei UI" w:hint="eastAsia"/>
+          <w:b/>
+          <w:bCs/>
+        </w:rPr>
+      </w:pPr>
+    </w:p>
+    <w:p>
+      <w:pPr>
+        <w:rPr>
+          <w:rFonts w:ascii="Microsoft YaHei UI" w:eastAsia="Microsoft YaHei UI" w:hAnsi="Microsoft YaHei UI"/>
+          <w:b/>
+          <w:bCs/>
+        </w:rPr>
+      </w:pPr>
+    </w:p>
+    <w:p>
+      <w:pPr>
+        <w:rPr>
+          <w:rFonts w:ascii="Microsoft YaHei UI" w:eastAsia="Microsoft YaHei UI" w:hAnsi="Microsoft YaHei UI"/>
+          <w:b/>
+          <w:bCs/>
+        </w:rPr>
+      </w:pPr>
+    </w:p>
+    <w:p>
+      <w:pPr>
+        <w:rPr>
+          <w:rFonts w:ascii="Microsoft YaHei UI" w:eastAsia="Microsoft YaHei UI" w:hAnsi="Microsoft YaHei UI"/>
+          <w:b/>
+          <w:bCs/>
+        </w:rPr>
+      </w:pPr>
+    </w:p>
+    <w:p>
+      <w:pPr>
+        <w:rPr>
+          <w:rFonts w:ascii="Microsoft YaHei UI" w:eastAsia="Microsoft YaHei UI" w:hAnsi="Microsoft YaHei UI"/>
+          <w:b/>
+          <w:bCs/>
+        </w:rPr>
+      </w:pPr>
+    </w:p>
+    <w:p>
+      <w:pPr>
+        <w:rPr>
+          <w:rFonts w:ascii="Microsoft YaHei UI" w:eastAsia="Microsoft YaHei UI" w:hAnsi="Microsoft YaHei UI"/>
+        </w:rPr>
+      </w:pPr>
+    </w:p>
+    <w:p>
+      <w:pPr>
+        <w:rPr>
+          <w:rFonts w:ascii="Microsoft YaHei UI" w:eastAsia="Microsoft YaHei UI" w:hAnsi="Microsoft YaHei UI"/>
+        </w:rPr>
+      </w:pPr>
+    </w:p>
+    <w:p>
+      <w:pPr>
+        <w:rPr>
+          <w:rFonts w:ascii="Microsoft YaHei UI" w:eastAsia="Microsoft YaHei UI" w:hAnsi="Microsoft YaHei UI"/>
+        </w:rPr>
+      </w:pPr>
+    </w:p>
+    <w:p>
+      <w:pPr>
+        <w:rPr>
+          <w:rFonts w:ascii="Microsoft YaHei UI" w:eastAsia="Microsoft YaHei UI" w:hAnsi="Microsoft YaHei UI"/>
+        </w:rPr>
+      </w:pPr>
+    </w:p>
+    <w:p>
+      <w:pPr>
+        <w:rPr>
+          <w:rFonts w:ascii="Microsoft YaHei UI" w:eastAsia="Microsoft YaHei UI" w:hAnsi="Microsoft YaHei UI"/>
+          <w:b/>
+          <w:bCs/>
+        </w:rPr>
+      </w:pPr>
+      <w:r>
+        <w:rPr>
+          <w:rFonts w:ascii="Microsoft YaHei UI" w:eastAsia="Microsoft YaHei UI" w:hAnsi="Microsoft YaHei UI" w:hint="eastAsia"/>
+          <w:b/>
+          <w:bCs/>
+        </w:rPr>
+        <w:t>任务</w:t>
+      </w:r>
+      <w:r>
+        <w:rPr>
+          <w:rFonts w:ascii="Microsoft YaHei UI" w:eastAsia="Microsoft YaHei UI" w:hAnsi="Microsoft YaHei UI" w:hint="eastAsia"/>
+          <w:b/>
+          <w:bCs/>
+        </w:rPr>
+        <w:t xml:space="preserve">三 </w:t>
+      </w:r>
+      <w:r>
+        <w:rPr>
+          <w:rFonts w:ascii="Microsoft YaHei UI" w:eastAsia="Microsoft YaHei UI" w:hAnsi="Microsoft YaHei UI" w:hint="eastAsia"/>
+          <w:b/>
+          <w:bCs/>
+        </w:rPr>
+        <w:t>(</w:t>
+      </w:r>
+      <w:r>
+        <w:rPr>
+          <w:rFonts w:ascii="Microsoft YaHei UI" w:eastAsia="Microsoft YaHei UI" w:hAnsi="Microsoft YaHei UI" w:hint="eastAsia"/>
+          <w:b/>
+          <w:bCs/>
+        </w:rPr>
+        <w:t>25</w:t>
+      </w:r>
+      <w:r>
+        <w:rPr>
+          <w:rFonts w:ascii="Microsoft YaHei UI" w:eastAsia="Microsoft YaHei UI" w:hAnsi="Microsoft YaHei UI" w:hint="eastAsia"/>
+          <w:b/>
+          <w:bCs/>
+        </w:rPr>
+        <w:t>分</w:t>
+      </w:r>
+      <w:r>
+        <w:rPr>
+          <w:rFonts w:ascii="Microsoft YaHei UI" w:eastAsia="Microsoft YaHei UI" w:hAnsi="Microsoft YaHei UI"/>
+          <w:b/>
+          <w:bCs/>
+        </w:rPr>
+        <w:t xml:space="preserve">) </w:t>
+      </w:r>
+    </w:p>
+    <w:p>
+      <w:pPr>
+        <w:rPr>
+          <w:rFonts w:ascii="Microsoft YaHei UI" w:eastAsia="Microsoft YaHei UI" w:hAnsi="Microsoft YaHei UI"/>
+        </w:rPr>
+      </w:pPr>
+    </w:p>
+    <w:p>
+      <w:pPr>
+        <w:rPr>
+          <w:rFonts w:ascii="Microsoft YaHei UI" w:eastAsia="Microsoft YaHei UI" w:hAnsi="Microsoft YaHei UI"/>
+        </w:rPr>
+      </w:pPr>
+    </w:p>
+    <w:p>
+      <w:pPr>
+        <w:rPr>
+          <w:rFonts w:ascii="Microsoft YaHei UI" w:eastAsia="Microsoft YaHei UI" w:hAnsi="Microsoft YaHei UI"/>
+        </w:rPr>
+      </w:pPr>
+    </w:p>
+    <w:p>
+      <w:pPr>
+        <w:rPr>
+          <w:rFonts w:ascii="Microsoft YaHei UI" w:eastAsia="Microsoft YaHei UI" w:hAnsi="Microsoft YaHei UI"/>
+        </w:rPr>
+      </w:pPr>
+    </w:p>
+    <w:p>
+      <w:pPr>
+        <w:rPr>
+          <w:rFonts w:ascii="Microsoft YaHei UI" w:eastAsia="Microsoft YaHei UI" w:hAnsi="Microsoft YaHei UI"/>
+        </w:rPr>
+      </w:pPr>
+    </w:p>
+    <w:p>
+      <w:pPr>
+        <w:rPr>
+          <w:rFonts w:ascii="Microsoft YaHei UI" w:eastAsia="Microsoft YaHei UI" w:hAnsi="Microsoft YaHei UI"/>
+        </w:rPr>
+      </w:pPr>
+    </w:p>
+    <w:p>
+      <w:pPr>
+        <w:rPr>
+          <w:rFonts w:ascii="Microsoft YaHei UI" w:eastAsia="Microsoft YaHei UI" w:hAnsi="Microsoft YaHei UI"/>
+        </w:rPr>
+      </w:pPr>
+    </w:p>
+    <w:p>
+      <w:pPr>
+        <w:rPr>
+          <w:rFonts w:ascii="Microsoft YaHei UI" w:eastAsia="Microsoft YaHei UI" w:hAnsi="Microsoft YaHei UI"/>
+        </w:rPr>
+      </w:pPr>
+    </w:p>
+    <w:p>
+      <w:pPr>
+        <w:rPr>
+          <w:rFonts w:ascii="Microsoft YaHei UI" w:eastAsia="Microsoft YaHei UI" w:hAnsi="Microsoft YaHei UI"/>
+        </w:rPr>
+      </w:pPr>
+    </w:p>
+    <w:p>
+      <w:pPr>
+        <w:rPr>
+          <w:rFonts w:ascii="Microsoft YaHei UI" w:eastAsia="Microsoft YaHei UI" w:hAnsi="Microsoft YaHei UI"/>
+        </w:rPr>
+      </w:pPr>
+    </w:p>
+    <w:p>
+      <w:pPr>
+        <w:rPr>
+          <w:rFonts w:ascii="Microsoft YaHei UI" w:eastAsia="Microsoft YaHei UI" w:hAnsi="Microsoft YaHei UI"/>
+        </w:rPr>
+      </w:pPr>
+    </w:p>
+    <w:p>
+      <w:pPr>
+        <w:rPr>
+          <w:rFonts w:ascii="Microsoft YaHei UI" w:eastAsia="Microsoft YaHei UI" w:hAnsi="Microsoft YaHei UI"/>
+        </w:rPr>
+      </w:pPr>
+    </w:p>
+    <w:p>
+      <w:pPr>
+        <w:rPr>
+          <w:rFonts w:ascii="Microsoft YaHei UI" w:eastAsia="Microsoft YaHei UI" w:hAnsi="Microsoft YaHei UI"/>
+        </w:rPr>
+      </w:pPr>
+    </w:p>
+    <w:p>
+      <w:pPr>
+        <w:rPr>
+          <w:rFonts w:ascii="Microsoft YaHei UI" w:eastAsia="Microsoft YaHei UI" w:hAnsi="Microsoft YaHei UI"/>
+        </w:rPr>
+      </w:pPr>
+    </w:p>
+    <w:p>
+      <w:pPr>
+        <w:rPr>
+          <w:rFonts w:ascii="Microsoft YaHei UI" w:eastAsia="Microsoft YaHei UI" w:hAnsi="Microsoft YaHei UI" w:hint="eastAsia"/>
+        </w:rPr>
+      </w:pPr>
+    </w:p>
+    <w:p>
+      <w:pPr>
+        <w:rPr>
+          <w:rFonts w:ascii="Microsoft YaHei UI" w:eastAsia="Microsoft YaHei UI" w:hAnsi="Microsoft YaHei UI"/>
+        </w:rPr>
+      </w:pPr>
+    </w:p>
+    <w:p>
+      <w:pPr>
+        <w:rPr>
+          <w:rFonts w:ascii="Microsoft YaHei UI" w:eastAsia="Microsoft YaHei UI" w:hAnsi="Microsoft YaHei UI"/>
+          <w:b/>
+          <w:bCs/>
+        </w:rPr>
+      </w:pPr>
+      <w:r>
+        <w:rPr>
+          <w:rFonts w:ascii="Microsoft YaHei UI" w:eastAsia="Microsoft YaHei UI" w:hAnsi="Microsoft YaHei UI" w:hint="eastAsia"/>
+          <w:b/>
+          <w:bCs/>
+        </w:rPr>
+        <w:t>任务</w:t>
+      </w:r>
+      <w:r>
+        <w:rPr>
+          <w:rFonts w:ascii="Microsoft YaHei UI" w:eastAsia="Microsoft YaHei UI" w:hAnsi="Microsoft YaHei UI" w:hint="eastAsia"/>
+          <w:b/>
+          <w:bCs/>
+        </w:rPr>
+        <w:t>四</w:t>
+      </w:r>
+      <w:r>
+        <w:rPr>
+          <w:rFonts w:ascii="Microsoft YaHei UI" w:eastAsia="Microsoft YaHei UI" w:hAnsi="Microsoft YaHei UI" w:hint="eastAsia"/>
+          <w:b/>
+          <w:bCs/>
+        </w:rPr>
         <w:t xml:space="preserve"> </w:t>
+      </w:r>
+      <w:r>
+        <w:rPr>
+          <w:rFonts w:ascii="Microsoft YaHei UI" w:eastAsia="Microsoft YaHei UI" w:hAnsi="Microsoft YaHei UI" w:hint="eastAsia"/>
+          <w:b/>
+          <w:bCs/>
+        </w:rPr>
+        <w:t>(</w:t>
+      </w:r>
+      <w:r>
+        <w:rPr>
+          <w:rFonts w:ascii="Microsoft YaHei UI" w:eastAsia="Microsoft YaHei UI" w:hAnsi="Microsoft YaHei UI" w:hint="eastAsia"/>
+          <w:b/>
+          <w:bCs/>
+        </w:rPr>
+        <w:t>25</w:t>
+      </w:r>
+      <w:r>
+        <w:rPr>
+          <w:rFonts w:ascii="Microsoft YaHei UI" w:eastAsia="Microsoft YaHei UI" w:hAnsi="Microsoft YaHei UI" w:hint="eastAsia"/>
+          <w:b/>
+          <w:bCs/>
+        </w:rPr>
+        <w:t>分</w:t>
+      </w:r>
+      <w:r>
+        <w:rPr>
+          <w:rFonts w:ascii="Microsoft YaHei UI" w:eastAsia="Microsoft YaHei UI" w:hAnsi="Microsoft YaHei UI"/>
+          <w:b/>
+          <w:bCs/>
+        </w:rPr>
+        <w:t xml:space="preserve">) </w:t>
       </w:r>
     </w:p>
     <w:p>
@@ -580,34 +1006,34 @@
 <w:ftr xmlns:wpc="http://schemas.microsoft.com/office/word/2010/wordprocessingCanvas" xmlns:cx="http://schemas.microsoft.com/office/drawing/2014/chartex" xmlns:cx1="http://schemas.microsoft.com/office/drawing/2015/9/8/chartex" xmlns:cx2="http://schemas.microsoft.com/office/drawing/2015/10/21/chartex" xmlns:cx3="http://schemas.microsoft.com/office/drawing/2016/5/9/chartex" xmlns:cx4="http://schemas.microsoft.com/office/drawing/2016/5/10/chartex" xmlns:cx5="http://schemas.microsoft.com/office/drawing/2016/5/11/chartex" xmlns:cx6="http://schemas.microsoft.com/office/drawing/2016/5/12/chartex" xmlns:cx7="http://schemas.microsoft.com/office/drawing/2016/5/13/chartex" xmlns:cx8="http://schemas.microsoft.com/office/drawing/2016/5/14/chartex" xmlns:mc="http://schemas.openxmlformats.org/markup-compatibility/2006" xmlns:aink="http://schemas.microsoft.com/office/drawing/2016/ink" xmlns:am3d="http://schemas.microsoft.com/office/drawing/2017/model3d" xmlns:o="urn:schemas-microsoft-com:office:office" xmlns:oel="http://schemas.microsoft.com/office/2019/extlst" xmlns:r="http://schemas.openxmlformats.org/officeDocument/2006/relationships" xmlns:m="http://schemas.openxmlformats.org/officeDocument/2006/math" xmlns:v="urn:schemas-microsoft-com:vml" xmlns:wp14="http://schemas.microsoft.com/office/word/2010/wordprocessingDrawing" xmlns:wp="http://schemas.openxmlformats.org/drawingml/2006/wordprocessingDrawing" xmlns:w10="urn:schemas-microsoft-com:office:word" xmlns:w="http://schemas.openxmlformats.org/wordprocessingml/2006/main" xmlns:w14="http://schemas.microsoft.com/office/word/2010/wordml" xmlns:w15="http://schemas.microsoft.com/office/word/2012/wordml" xmlns:w16cex="http://schemas.microsoft.com/office/word/2018/wordml/cex" xmlns:w16cid="http://schemas.microsoft.com/office/word/2016/wordml/cid" xmlns:w16="http://schemas.microsoft.com/office/word/2018/wordml" xmlns:w16du="http://schemas.microsoft.com/office/word/2023/wordml/word16du" xmlns:w16sdtdh="http://schemas.microsoft.com/office/word/2020/wordml/sdtdatahash" xmlns:w16sdtfl="http://schemas.microsoft.com/office/word/2024/wordml/sdtformatlock" xmlns:w16se="http://schemas.microsoft.com/office/word/2015/wordml/symex" xmlns:wpg="http://schemas.microsoft.com/office/word/2010/wordprocessingGroup" xmlns:wpi="http://schemas.microsoft.com/office/word/2010/wordprocessingInk" xmlns:wne="http://schemas.microsoft.com/office/word/2006/wordml" xmlns:wps="http://schemas.microsoft.com/office/word/2010/wordprocessingShape" mc:Ignorable="w14 w15 w16se w16cid w16 w16cex w16sdtdh w16sdtfl w16du wp14">
   <w:p>
     <w:pPr>
-      <w:pStyle w:val="ad"/>
+      <w:pStyle w:val="Footer"/>
       <w:framePr w:wrap="none" w:vAnchor="text" w:hAnchor="margin" w:xAlign="center" w:y="1"/>
       <w:rPr>
-        <w:rStyle w:val="af"/>
+        <w:rStyle w:val="PageNumber"/>
       </w:rPr>
     </w:pPr>
     <w:r>
       <w:rPr>
-        <w:rStyle w:val="af"/>
+        <w:rStyle w:val="PageNumber"/>
       </w:rPr>
       <w:fldChar w:fldCharType="begin"/>
     </w:r>
     <w:r>
       <w:rPr>
-        <w:rStyle w:val="af"/>
+        <w:rStyle w:val="PageNumber"/>
       </w:rPr>
       <w:instrText xml:space="preserve"> PAGE </w:instrText>
     </w:r>
     <w:r>
       <w:rPr>
-        <w:rStyle w:val="af"/>
+        <w:rStyle w:val="PageNumber"/>
       </w:rPr>
       <w:fldChar w:fldCharType="end"/>
     </w:r>
   </w:p>
   <w:p>
     <w:pPr>
-      <w:pStyle w:val="ad"/>
+      <w:pStyle w:val="Footer"/>
     </w:pPr>
   </w:p>
 </w:ftr>
@@ -618,7 +1044,7 @@
   <w:sdt>
     <w:sdtPr>
       <w:rPr>
-        <w:rStyle w:val="af"/>
+        <w:rStyle w:val="PageNumber"/>
       </w:rPr>
       <w:id w:val="-884638618"/>
       <w:docPartObj>
@@ -626,48 +1052,43 @@
         <w:docPartUnique/>
       </w:docPartObj>
     </w:sdtPr>
-    <w:sdtEndPr>
-      <w:rPr>
-        <w:rStyle w:val="af"/>
-      </w:rPr>
-    </w:sdtEndPr>
     <w:sdtContent>
       <w:p>
         <w:pPr>
-          <w:pStyle w:val="ad"/>
+          <w:pStyle w:val="Footer"/>
           <w:framePr w:wrap="none" w:vAnchor="text" w:hAnchor="margin" w:xAlign="center" w:y="1"/>
           <w:rPr>
-            <w:rStyle w:val="af"/>
+            <w:rStyle w:val="PageNumber"/>
           </w:rPr>
         </w:pPr>
         <w:r>
           <w:rPr>
-            <w:rStyle w:val="af"/>
+            <w:rStyle w:val="PageNumber"/>
           </w:rPr>
           <w:fldChar w:fldCharType="begin"/>
         </w:r>
         <w:r>
           <w:rPr>
-            <w:rStyle w:val="af"/>
+            <w:rStyle w:val="PageNumber"/>
           </w:rPr>
           <w:instrText xml:space="preserve"> PAGE </w:instrText>
         </w:r>
         <w:r>
           <w:rPr>
-            <w:rStyle w:val="af"/>
+            <w:rStyle w:val="PageNumber"/>
           </w:rPr>
           <w:fldChar w:fldCharType="separate"/>
         </w:r>
         <w:r>
           <w:rPr>
-            <w:rStyle w:val="af"/>
+            <w:rStyle w:val="PageNumber"/>
             <w:noProof/>
           </w:rPr>
           <w:t>1</w:t>
         </w:r>
         <w:r>
           <w:rPr>
-            <w:rStyle w:val="af"/>
+            <w:rStyle w:val="PageNumber"/>
           </w:rPr>
           <w:fldChar w:fldCharType="end"/>
         </w:r>
@@ -676,7 +1097,7 @@
   </w:sdt>
   <w:p>
     <w:pPr>
-      <w:pStyle w:val="ad"/>
+      <w:pStyle w:val="Footer"/>
     </w:pPr>
   </w:p>
 </w:ftr>
@@ -727,7 +1148,7 @@
         </w:tcPr>
         <w:p>
           <w:pPr>
-            <w:pStyle w:val="ab"/>
+            <w:pStyle w:val="Header"/>
             <w:ind w:left="-115"/>
           </w:pPr>
         </w:p>
@@ -738,7 +1159,7 @@
         </w:tcPr>
         <w:p>
           <w:pPr>
-            <w:pStyle w:val="ab"/>
+            <w:pStyle w:val="Header"/>
             <w:jc w:val="center"/>
           </w:pPr>
         </w:p>
@@ -749,7 +1170,7 @@
         </w:tcPr>
         <w:p>
           <w:pPr>
-            <w:pStyle w:val="ab"/>
+            <w:pStyle w:val="Header"/>
             <w:ind w:right="-115"/>
             <w:jc w:val="right"/>
           </w:pPr>
@@ -759,7 +1180,7 @@
   </w:tbl>
   <w:p>
     <w:pPr>
-      <w:pStyle w:val="ab"/>
+      <w:pStyle w:val="Header"/>
     </w:pPr>
   </w:p>
 </w:hdr>
@@ -1555,7 +1976,7 @@
         <w:ind w:left="720" w:hanging="360"/>
       </w:pPr>
       <w:rPr>
-        <w:rFonts w:ascii="微软雅黑" w:eastAsia="微软雅黑" w:hAnsi="微软雅黑" w:hint="default"/>
+        <w:rFonts w:ascii="Microsoft YaHei" w:eastAsia="Microsoft YaHei" w:hAnsi="Microsoft YaHei" w:hint="default"/>
       </w:rPr>
     </w:lvl>
     <w:lvl w:ilvl="1" w:tplc="08090019" w:tentative="1">
@@ -2018,7 +2439,7 @@
         <w:ind w:left="740" w:hanging="380"/>
       </w:pPr>
       <w:rPr>
-        <w:rFonts w:ascii="微软雅黑" w:eastAsia="微软雅黑" w:hAnsi="微软雅黑" w:hint="default"/>
+        <w:rFonts w:ascii="Microsoft YaHei" w:eastAsia="Microsoft YaHei" w:hAnsi="Microsoft YaHei" w:hint="default"/>
       </w:rPr>
     </w:lvl>
     <w:lvl w:ilvl="1" w:tplc="08090019" w:tentative="1">
@@ -3178,18 +3599,18 @@
     <w:lsdException w:name="Unresolved Mention" w:semiHidden="1" w:unhideWhenUsed="1"/>
     <w:lsdException w:name="Smart Link" w:semiHidden="1" w:unhideWhenUsed="1"/>
   </w:latentStyles>
-  <w:style w:type="paragraph" w:default="1" w:styleId="a">
+  <w:style w:type="paragraph" w:default="1" w:styleId="Normal">
     <w:name w:val="Normal"/>
     <w:qFormat/>
-    <w:rsid w:val="001352C5"/>
+    <w:rsid w:val="00C24AD3"/>
   </w:style>
-  <w:style w:type="character" w:default="1" w:styleId="a0">
+  <w:style w:type="character" w:default="1" w:styleId="DefaultParagraphFont">
     <w:name w:val="Default Paragraph Font"/>
     <w:uiPriority w:val="1"/>
     <w:semiHidden/>
     <w:unhideWhenUsed/>
   </w:style>
-  <w:style w:type="table" w:default="1" w:styleId="a1">
+  <w:style w:type="table" w:default="1" w:styleId="TableNormal">
     <w:name w:val="Normal Table"/>
     <w:uiPriority w:val="99"/>
     <w:semiHidden/>
@@ -3204,15 +3625,15 @@
       </w:tblCellMar>
     </w:tblPr>
   </w:style>
-  <w:style w:type="numbering" w:default="1" w:styleId="a2">
+  <w:style w:type="numbering" w:default="1" w:styleId="NoList">
     <w:name w:val="No List"/>
     <w:uiPriority w:val="99"/>
     <w:semiHidden/>
     <w:unhideWhenUsed/>
   </w:style>
-  <w:style w:type="paragraph" w:styleId="a3">
+  <w:style w:type="paragraph" w:styleId="ListParagraph">
     <w:name w:val="List Paragraph"/>
-    <w:basedOn w:val="a"/>
+    <w:basedOn w:val="Normal"/>
     <w:uiPriority w:val="34"/>
     <w:qFormat/>
     <w:rsid w:val="003076E7"/>
@@ -3221,9 +3642,9 @@
       <w:contextualSpacing/>
     </w:pPr>
   </w:style>
-  <w:style w:type="character" w:styleId="a4">
+  <w:style w:type="character" w:styleId="Hyperlink">
     <w:name w:val="Hyperlink"/>
-    <w:basedOn w:val="a0"/>
+    <w:basedOn w:val="DefaultParagraphFont"/>
     <w:uiPriority w:val="99"/>
     <w:unhideWhenUsed/>
     <w:rsid w:val="00EB67B2"/>
@@ -3232,9 +3653,9 @@
       <w:u w:val="single"/>
     </w:rPr>
   </w:style>
-  <w:style w:type="character" w:styleId="a5">
+  <w:style w:type="character" w:styleId="UnresolvedMention">
     <w:name w:val="Unresolved Mention"/>
-    <w:basedOn w:val="a0"/>
+    <w:basedOn w:val="DefaultParagraphFont"/>
     <w:uiPriority w:val="99"/>
     <w:semiHidden/>
     <w:unhideWhenUsed/>
@@ -3244,9 +3665,9 @@
       <w:shd w:val="clear" w:color="auto" w:fill="E1DFDD"/>
     </w:rPr>
   </w:style>
-  <w:style w:type="character" w:styleId="a6">
+  <w:style w:type="character" w:styleId="FollowedHyperlink">
     <w:name w:val="FollowedHyperlink"/>
-    <w:basedOn w:val="a0"/>
+    <w:basedOn w:val="DefaultParagraphFont"/>
     <w:uiPriority w:val="99"/>
     <w:semiHidden/>
     <w:unhideWhenUsed/>
@@ -3256,11 +3677,11 @@
       <w:u w:val="single"/>
     </w:rPr>
   </w:style>
-  <w:style w:type="paragraph" w:styleId="a7">
+  <w:style w:type="paragraph" w:styleId="Title">
     <w:name w:val="Title"/>
-    <w:basedOn w:val="a"/>
-    <w:next w:val="a8"/>
-    <w:link w:val="a9"/>
+    <w:basedOn w:val="Normal"/>
+    <w:next w:val="Subtitle"/>
+    <w:link w:val="TitleChar1"/>
     <w:qFormat/>
     <w:rsid w:val="00D9233A"/>
     <w:pPr>
@@ -3287,7 +3708,7 @@
   </w:style>
   <w:style w:type="character" w:customStyle="1" w:styleId="TitleChar">
     <w:name w:val="Title Char"/>
-    <w:basedOn w:val="a0"/>
+    <w:basedOn w:val="DefaultParagraphFont"/>
     <w:uiPriority w:val="10"/>
     <w:rsid w:val="00D9233A"/>
     <w:rPr>
@@ -3298,10 +3719,10 @@
       <w:szCs w:val="56"/>
     </w:rPr>
   </w:style>
-  <w:style w:type="character" w:customStyle="1" w:styleId="a9">
-    <w:name w:val="标题 字符"/>
-    <w:basedOn w:val="a0"/>
-    <w:link w:val="a7"/>
+  <w:style w:type="character" w:customStyle="1" w:styleId="TitleChar1">
+    <w:name w:val="Title Char1"/>
+    <w:basedOn w:val="DefaultParagraphFont"/>
+    <w:link w:val="Title"/>
     <w:locked/>
     <w:rsid w:val="00D9233A"/>
     <w:rPr>
@@ -3315,11 +3736,11 @@
       <w:lang w:val="en-US"/>
     </w:rPr>
   </w:style>
-  <w:style w:type="paragraph" w:styleId="a8">
+  <w:style w:type="paragraph" w:styleId="Subtitle">
     <w:name w:val="Subtitle"/>
-    <w:basedOn w:val="a"/>
-    <w:next w:val="a"/>
-    <w:link w:val="aa"/>
+    <w:basedOn w:val="Normal"/>
+    <w:next w:val="Normal"/>
+    <w:link w:val="SubtitleChar"/>
     <w:uiPriority w:val="11"/>
     <w:qFormat/>
     <w:rsid w:val="00D9233A"/>
@@ -3336,10 +3757,10 @@
       <w:szCs w:val="22"/>
     </w:rPr>
   </w:style>
-  <w:style w:type="character" w:customStyle="1" w:styleId="aa">
-    <w:name w:val="副标题 字符"/>
-    <w:basedOn w:val="a0"/>
-    <w:link w:val="a8"/>
+  <w:style w:type="character" w:customStyle="1" w:styleId="SubtitleChar">
+    <w:name w:val="Subtitle Char"/>
+    <w:basedOn w:val="DefaultParagraphFont"/>
+    <w:link w:val="Subtitle"/>
     <w:uiPriority w:val="11"/>
     <w:rsid w:val="00D9233A"/>
     <w:rPr>
@@ -3349,10 +3770,10 @@
       <w:szCs w:val="22"/>
     </w:rPr>
   </w:style>
-  <w:style w:type="paragraph" w:styleId="ab">
+  <w:style w:type="paragraph" w:styleId="Header">
     <w:name w:val="header"/>
-    <w:basedOn w:val="a"/>
-    <w:link w:val="ac"/>
+    <w:basedOn w:val="Normal"/>
+    <w:link w:val="HeaderChar"/>
     <w:uiPriority w:val="99"/>
     <w:unhideWhenUsed/>
     <w:rsid w:val="000434E6"/>
@@ -3363,17 +3784,17 @@
       </w:tabs>
     </w:pPr>
   </w:style>
-  <w:style w:type="character" w:customStyle="1" w:styleId="ac">
-    <w:name w:val="页眉 字符"/>
-    <w:basedOn w:val="a0"/>
-    <w:link w:val="ab"/>
+  <w:style w:type="character" w:customStyle="1" w:styleId="HeaderChar">
+    <w:name w:val="Header Char"/>
+    <w:basedOn w:val="DefaultParagraphFont"/>
+    <w:link w:val="Header"/>
     <w:uiPriority w:val="99"/>
     <w:rsid w:val="000434E6"/>
   </w:style>
-  <w:style w:type="paragraph" w:styleId="ad">
+  <w:style w:type="paragraph" w:styleId="Footer">
     <w:name w:val="footer"/>
-    <w:basedOn w:val="a"/>
-    <w:link w:val="ae"/>
+    <w:basedOn w:val="Normal"/>
+    <w:link w:val="FooterChar"/>
     <w:uiPriority w:val="99"/>
     <w:unhideWhenUsed/>
     <w:rsid w:val="000434E6"/>
@@ -3384,24 +3805,24 @@
       </w:tabs>
     </w:pPr>
   </w:style>
-  <w:style w:type="character" w:customStyle="1" w:styleId="ae">
-    <w:name w:val="页脚 字符"/>
-    <w:basedOn w:val="a0"/>
-    <w:link w:val="ad"/>
+  <w:style w:type="character" w:customStyle="1" w:styleId="FooterChar">
+    <w:name w:val="Footer Char"/>
+    <w:basedOn w:val="DefaultParagraphFont"/>
+    <w:link w:val="Footer"/>
     <w:uiPriority w:val="99"/>
     <w:rsid w:val="000434E6"/>
   </w:style>
-  <w:style w:type="character" w:styleId="af">
+  <w:style w:type="character" w:styleId="PageNumber">
     <w:name w:val="page number"/>
-    <w:basedOn w:val="a0"/>
+    <w:basedOn w:val="DefaultParagraphFont"/>
     <w:uiPriority w:val="99"/>
     <w:semiHidden/>
     <w:unhideWhenUsed/>
     <w:rsid w:val="00DB64C9"/>
   </w:style>
-  <w:style w:type="table" w:styleId="af0">
+  <w:style w:type="table" w:styleId="TableGrid">
     <w:name w:val="Table Grid"/>
-    <w:basedOn w:val="a1"/>
+    <w:basedOn w:val="TableNormal"/>
     <w:uiPriority w:val="59"/>
     <w:rsid w:val="00FB4123"/>
     <w:tblPr>
@@ -3415,9 +3836,9 @@
       </w:tblBorders>
     </w:tblPr>
   </w:style>
-  <w:style w:type="character" w:styleId="af1">
+  <w:style w:type="character" w:styleId="PlaceholderText">
     <w:name w:val="Placeholder Text"/>
-    <w:basedOn w:val="a0"/>
+    <w:basedOn w:val="DefaultParagraphFont"/>
     <w:uiPriority w:val="99"/>
     <w:semiHidden/>
     <w:rsid w:val="0026154F"/>

</xml_diff>